<commit_message>
Phụ lục 01: phụ kiện ống thép Xưởng 1 để KL 1, đơn giá 10.494.036
Co-Authored-By: Claude Opus 5.5 <noreply@anthropic.com>
Claude-Session: https://claude.ai/code/session_01CuX5Gma6ZQnfcApGLH6XHu
</commit_message>
<xml_diff>
--- a/HD-Nha-may-nhua-bo-X2-BG-23-09-2025-1297tr.docx
+++ b/HD-Nha-may-nhua-bo-X2-BG-23-09-2025-1297tr.docx
@@ -30225,7 +30225,7 @@
                 <w:sz w:val="22"/>
                 <w:szCs w:val="22"/>
               </w:rPr>
-              <w:t xml:space="preserve">0,5</w:t>
+              <w:t xml:space="preserve">1</w:t>
             </w:r>
           </w:p>
         </w:tc>
@@ -30262,7 +30262,7 @@
                 <w:sz w:val="22"/>
                 <w:szCs w:val="22"/>
               </w:rPr>
-              <w:t xml:space="preserve">20.988.072</w:t>
+              <w:t xml:space="preserve">10.494.036</w:t>
             </w:r>
           </w:p>
         </w:tc>

</xml_diff>